<commit_message>
Práctica 3 traducida, con reloj.s y sus soluciones. Pequeños cambios en otras dos de las prácticas
</commit_message>
<xml_diff>
--- a/ETC_RISCV/Laboratorio/Práctica 01 - Registros y memoria principal - Castellano - RISC-V.docx
+++ b/ETC_RISCV/Laboratorio/Práctica 01 - Registros y memoria principal - Castellano - RISC-V.docx
@@ -522,6 +522,14 @@
           <w:lang w:val="es-ES"/>
         </w:rPr>
       </w:pPr>
+    </w:p>
+    <w:p>
+      <w:pPr>
+        <w:pStyle w:val="Ttulo2"/>
+        <w:rPr>
+          <w:lang w:val="es-ES"/>
+        </w:rPr>
+      </w:pPr>
       <w:r>
         <w:rPr>
           <w:lang w:val="es-ES"/>
@@ -606,6 +614,7 @@
     <w:p>
       <w:pPr>
         <w:pStyle w:val="Pargraf"/>
+        <w:spacing w:line="240" w:lineRule="auto"/>
         <w:rPr>
           <w:lang w:val="es-ES"/>
         </w:rPr>
@@ -644,6 +653,7 @@
     <w:p>
       <w:pPr>
         <w:pStyle w:val="Pargraf"/>
+        <w:spacing w:line="240" w:lineRule="auto"/>
         <w:rPr>
           <w:lang w:val="es-ES"/>
         </w:rPr>
@@ -2671,6 +2681,7 @@
     <w:p>
       <w:pPr>
         <w:pStyle w:val="Pargraf"/>
+        <w:spacing w:line="240" w:lineRule="auto"/>
         <w:rPr>
           <w:lang w:val="es-ES"/>
         </w:rPr>
@@ -2751,6 +2762,7 @@
     <w:p>
       <w:pPr>
         <w:pStyle w:val="Pargraf"/>
+        <w:spacing w:line="240" w:lineRule="auto"/>
         <w:rPr>
           <w:lang w:val="es-ES"/>
         </w:rPr>
@@ -2823,6 +2835,7 @@
           <w:ilvl w:val="0"/>
           <w:numId w:val="11"/>
         </w:numPr>
+        <w:spacing w:line="240" w:lineRule="auto"/>
       </w:pPr>
       <w:r>
         <w:t>La pseudoinstrucció</w:t>
@@ -3142,113 +3155,114 @@
           <w:ilvl w:val="0"/>
           <w:numId w:val="11"/>
         </w:numPr>
-      </w:pPr>
+        <w:spacing w:line="240" w:lineRule="auto"/>
+      </w:pPr>
+      <w:r>
+        <w:t>La pseudoinstrucció</w:t>
+      </w:r>
+      <w:r>
+        <w:t>n</w:t>
+      </w:r>
+      <w:r>
+        <w:t xml:space="preserve"> </w:t>
+      </w:r>
+      <w:r>
+        <w:rPr>
+          <w:rStyle w:val="codiinline"/>
+          <w:b w:val="0"/>
+          <w:bCs/>
+        </w:rPr>
+        <w:t>li</w:t>
+      </w:r>
+      <w:r>
+        <w:rPr>
+          <w:b/>
+          <w:bCs/>
+        </w:rPr>
+        <w:t xml:space="preserve"> </w:t>
+      </w:r>
+      <w:r>
+        <w:t>(</w:t>
+      </w:r>
+      <w:r>
+        <w:rPr>
+          <w:i/>
+        </w:rPr>
+        <w:t>load immediate</w:t>
+      </w:r>
+      <w:r>
+        <w:t xml:space="preserve">) </w:t>
+      </w:r>
+      <w:r>
+        <w:t>resuelve</w:t>
+      </w:r>
+      <w:r>
+        <w:t xml:space="preserve"> un problema de programació</w:t>
+      </w:r>
+      <w:r>
+        <w:t>n bá</w:t>
+      </w:r>
+      <w:r>
+        <w:t>sic</w:t>
+      </w:r>
+      <w:r>
+        <w:t>o</w:t>
+      </w:r>
+      <w:r>
+        <w:t xml:space="preserve">: </w:t>
+      </w:r>
+      <w:r>
+        <w:t>as</w:t>
+      </w:r>
+      <w:r>
+        <w:t>ignar</w:t>
+      </w:r>
+      <w:r>
+        <w:t xml:space="preserve"> una constan</w:t>
+      </w:r>
+      <w:r>
+        <w:t>t</w:t>
+      </w:r>
+      <w:r>
+        <w:t>e</w:t>
+      </w:r>
+      <w:r>
+        <w:t xml:space="preserve"> </w:t>
+      </w:r>
+      <w:r>
+        <w:rPr>
+          <w:rStyle w:val="codiinline"/>
+          <w:b w:val="0"/>
+          <w:bCs/>
+        </w:rPr>
+        <w:t>K</w:t>
+      </w:r>
+      <w:r>
+        <w:t xml:space="preserve"> </w:t>
+      </w:r>
+      <w:r>
+        <w:t>a</w:t>
+      </w:r>
+      <w:r>
+        <w:t xml:space="preserve"> un registro</w:t>
+      </w:r>
+      <w:r>
+        <w:t xml:space="preserve">. </w:t>
+      </w:r>
+      <w:r>
+        <w:t>El programador en ensa</w:t>
+      </w:r>
+      <w:r>
+        <w:t xml:space="preserve">mblador </w:t>
+      </w:r>
+      <w:r>
+        <w:t>sólo debe</w:t>
+      </w:r>
+      <w:r>
+        <w:t xml:space="preserve"> </w:t>
+      </w:r>
       <w:r>
         <w:lastRenderedPageBreak/>
-        <w:t>La pseudoinstrucció</w:t>
-      </w:r>
-      <w:r>
-        <w:t>n</w:t>
-      </w:r>
-      <w:r>
-        <w:t xml:space="preserve"> </w:t>
-      </w:r>
-      <w:r>
-        <w:rPr>
-          <w:rStyle w:val="codiinline"/>
-          <w:b w:val="0"/>
-          <w:bCs/>
-        </w:rPr>
-        <w:t>li</w:t>
-      </w:r>
-      <w:r>
-        <w:rPr>
-          <w:b/>
-          <w:bCs/>
-        </w:rPr>
-        <w:t xml:space="preserve"> </w:t>
-      </w:r>
-      <w:r>
-        <w:t>(</w:t>
-      </w:r>
-      <w:r>
-        <w:rPr>
-          <w:i/>
-        </w:rPr>
-        <w:t>load immediate</w:t>
-      </w:r>
-      <w:r>
-        <w:t xml:space="preserve">) </w:t>
-      </w:r>
-      <w:r>
-        <w:t>resuelve</w:t>
-      </w:r>
-      <w:r>
-        <w:t xml:space="preserve"> un problema de programació</w:t>
-      </w:r>
-      <w:r>
-        <w:t>n bá</w:t>
-      </w:r>
-      <w:r>
-        <w:t>sic</w:t>
-      </w:r>
-      <w:r>
-        <w:t>o</w:t>
-      </w:r>
-      <w:r>
-        <w:t xml:space="preserve">: </w:t>
-      </w:r>
-      <w:r>
-        <w:t>as</w:t>
-      </w:r>
-      <w:r>
-        <w:t>ignar</w:t>
-      </w:r>
-      <w:r>
-        <w:t xml:space="preserve"> una constan</w:t>
-      </w:r>
-      <w:r>
-        <w:t>t</w:t>
-      </w:r>
-      <w:r>
-        <w:t>e</w:t>
-      </w:r>
-      <w:r>
-        <w:t xml:space="preserve"> </w:t>
-      </w:r>
-      <w:r>
-        <w:rPr>
-          <w:rStyle w:val="codiinline"/>
-          <w:b w:val="0"/>
-          <w:bCs/>
-        </w:rPr>
-        <w:t>K</w:t>
-      </w:r>
-      <w:r>
-        <w:t xml:space="preserve"> </w:t>
-      </w:r>
-      <w:r>
-        <w:t>a</w:t>
-      </w:r>
-      <w:r>
-        <w:t xml:space="preserve"> un registro</w:t>
-      </w:r>
-      <w:r>
-        <w:t xml:space="preserve">. </w:t>
-      </w:r>
-      <w:r>
-        <w:t>El programador en ensa</w:t>
-      </w:r>
-      <w:r>
-        <w:t xml:space="preserve">mblador </w:t>
-      </w:r>
-      <w:r>
-        <w:t>sólo debe</w:t>
-      </w:r>
-      <w:r>
-        <w:t xml:space="preserve"> </w:t>
-      </w:r>
-      <w:r>
         <w:t>escribir una líne</w:t>
       </w:r>
       <w:r>
@@ -4492,6 +4506,7 @@
           <w:ilvl w:val="0"/>
           <w:numId w:val="16"/>
         </w:numPr>
+        <w:spacing w:line="240" w:lineRule="auto"/>
         <w:rPr>
           <w:rStyle w:val="codiinline"/>
           <w:lang w:val="es-ES_tradnl"/>
@@ -4567,6 +4582,658 @@
           <w:w w:val="100"/>
         </w:rPr>
         <w:t xml:space="preserve"> </w:t>
+      </w:r>
+    </w:p>
+    <w:p>
+      <w:pPr>
+        <w:pStyle w:val="Codi"/>
+        <w:spacing w:line="240" w:lineRule="auto"/>
+        <w:ind w:left="2832" w:right="2262"/>
+        <w:jc w:val="left"/>
+        <w:rPr>
+          <w:rStyle w:val="codiinline"/>
+          <w:bCs/>
+          <w:lang w:val="ca-ES"/>
+        </w:rPr>
+      </w:pPr>
+      <w:r>
+        <w:rPr>
+          <w:rStyle w:val="codiinline"/>
+          <w:b/>
+          <w:sz w:val="18"/>
+          <w:lang w:val="ca-ES"/>
+        </w:rPr>
+        <w:t xml:space="preserve">        </w:t>
+      </w:r>
+      <w:r>
+        <w:rPr>
+          <w:rStyle w:val="codiinline"/>
+          <w:b/>
+          <w:sz w:val="18"/>
+          <w:lang w:val="ca-ES"/>
+        </w:rPr>
+        <w:t xml:space="preserve">   </w:t>
+      </w:r>
+      <w:r>
+        <w:rPr>
+          <w:rStyle w:val="codiinline"/>
+          <w:bCs/>
+          <w:lang w:val="ca-ES"/>
+        </w:rPr>
+        <w:t>.data</w:t>
+      </w:r>
+    </w:p>
+    <w:p>
+      <w:pPr>
+        <w:pStyle w:val="Codi"/>
+        <w:spacing w:line="240" w:lineRule="auto"/>
+        <w:ind w:left="2832" w:right="2262"/>
+        <w:jc w:val="left"/>
+        <w:rPr>
+          <w:rStyle w:val="codiinline"/>
+          <w:bCs/>
+        </w:rPr>
+      </w:pPr>
+      <w:r>
+        <w:rPr>
+          <w:rStyle w:val="codiinline"/>
+          <w:bCs/>
+          <w:lang w:val="ca-ES"/>
+        </w:rPr>
+        <w:t>aux:    .word -1</w:t>
+      </w:r>
+    </w:p>
+    <w:p>
+      <w:pPr>
+        <w:pStyle w:val="Codi"/>
+        <w:spacing w:line="240" w:lineRule="auto"/>
+        <w:ind w:left="2832" w:right="2262"/>
+        <w:jc w:val="left"/>
+        <w:rPr>
+          <w:rStyle w:val="codiinline"/>
+          <w:bCs/>
+        </w:rPr>
+      </w:pPr>
+      <w:r>
+        <w:rPr>
+          <w:rStyle w:val="codiinline"/>
+          <w:bCs/>
+          <w:lang w:val="ca-ES"/>
+        </w:rPr>
+        <w:t xml:space="preserve">cadena: </w:t>
+      </w:r>
+      <w:commentRangeStart w:id="2"/>
+      <w:r>
+        <w:rPr>
+          <w:rStyle w:val="codiinline"/>
+          <w:bCs/>
+          <w:lang w:val="ca-ES"/>
+        </w:rPr>
+        <w:t xml:space="preserve">.asciz </w:t>
+      </w:r>
+      <w:commentRangeEnd w:id="2"/>
+      <w:r>
+        <w:rPr>
+          <w:rStyle w:val="Refdecomentario"/>
+          <w:b w:val="0"/>
+          <w:bCs/>
+          <w:w w:val="80"/>
+          <w:sz w:val="24"/>
+          <w:szCs w:val="24"/>
+          <w:lang w:val="ca-ES"/>
+        </w:rPr>
+        <w:commentReference w:id="2"/>
+      </w:r>
+      <w:r>
+        <w:rPr>
+          <w:rStyle w:val="codiinline"/>
+          <w:bCs/>
+          <w:lang w:val="ca-ES"/>
+        </w:rPr>
+        <w:t>“</w:t>
+      </w:r>
+      <w:r>
+        <w:rPr>
+          <w:rStyle w:val="codiinline"/>
+          <w:bCs/>
+          <w:lang w:val="ca-ES"/>
+        </w:rPr>
+        <w:t>Hola mundo”</w:t>
+      </w:r>
+    </w:p>
+    <w:p>
+      <w:pPr>
+        <w:pStyle w:val="Pargraf"/>
+        <w:spacing w:line="240" w:lineRule="auto"/>
+        <w:ind w:left="708"/>
+        <w:rPr>
+          <w:lang w:val="es-ES"/>
+        </w:rPr>
+      </w:pPr>
+      <w:r>
+        <w:rPr>
+          <w:lang w:val="es-ES"/>
+        </w:rPr>
+        <w:t xml:space="preserve">y el segmento de datos empieza en la dirección </w:t>
+      </w:r>
+      <w:r>
+        <w:rPr>
+          <w:rStyle w:val="codiinline"/>
+          <w:b w:val="0"/>
+          <w:bCs/>
+        </w:rPr>
+        <w:t>0x</w:t>
+      </w:r>
+      <w:r>
+        <w:rPr>
+          <w:rStyle w:val="codiinline"/>
+          <w:b w:val="0"/>
+          <w:bCs/>
+        </w:rPr>
+        <w:t>1</w:t>
+      </w:r>
+      <w:r>
+        <w:rPr>
+          <w:rStyle w:val="codiinline"/>
+          <w:b w:val="0"/>
+          <w:bCs/>
+        </w:rPr>
+        <w:t>000</w:t>
+      </w:r>
+      <w:r>
+        <w:rPr>
+          <w:rStyle w:val="codiinline"/>
+          <w:b w:val="0"/>
+          <w:bCs/>
+        </w:rPr>
+        <w:t>0</w:t>
+      </w:r>
+      <w:r>
+        <w:rPr>
+          <w:rStyle w:val="codiinline"/>
+          <w:b w:val="0"/>
+          <w:bCs/>
+        </w:rPr>
+        <w:t>000</w:t>
+      </w:r>
+      <w:r>
+        <w:rPr>
+          <w:rStyle w:val="codiinline"/>
+        </w:rPr>
+        <w:t xml:space="preserve">, </w:t>
+      </w:r>
+      <w:r>
+        <w:rPr>
+          <w:lang w:val="es-ES"/>
+        </w:rPr>
+        <w:t xml:space="preserve">la pseudoinstrucción </w:t>
+      </w:r>
+      <w:r>
+        <w:rPr>
+          <w:rStyle w:val="codiinline"/>
+          <w:b w:val="0"/>
+          <w:bCs/>
+          <w:lang w:val="es-ES"/>
+        </w:rPr>
+        <w:t xml:space="preserve">la </w:t>
+      </w:r>
+      <w:r>
+        <w:rPr>
+          <w:rStyle w:val="codiinline"/>
+          <w:b w:val="0"/>
+          <w:bCs/>
+          <w:lang w:val="es-ES"/>
+        </w:rPr>
+        <w:t>t</w:t>
+      </w:r>
+      <w:r>
+        <w:rPr>
+          <w:rStyle w:val="codiinline"/>
+          <w:b w:val="0"/>
+          <w:bCs/>
+          <w:lang w:val="es-ES"/>
+        </w:rPr>
+        <w:t>0</w:t>
+      </w:r>
+      <w:r>
+        <w:rPr>
+          <w:rStyle w:val="codiinline"/>
+          <w:b w:val="0"/>
+          <w:bCs/>
+          <w:lang w:val="es-ES"/>
+        </w:rPr>
+        <w:t>,</w:t>
+      </w:r>
+      <w:r>
+        <w:rPr>
+          <w:rStyle w:val="codiinline"/>
+          <w:b w:val="0"/>
+          <w:bCs/>
+          <w:lang w:val="es-ES"/>
+        </w:rPr>
+        <w:t>aux</w:t>
+      </w:r>
+      <w:r>
+        <w:rPr>
+          <w:lang w:val="es-ES"/>
+        </w:rPr>
+        <w:t xml:space="preserve"> copiará en </w:t>
+      </w:r>
+      <w:r>
+        <w:rPr>
+          <w:rStyle w:val="codiinline"/>
+          <w:b w:val="0"/>
+          <w:bCs/>
+          <w:lang w:val="es-ES"/>
+        </w:rPr>
+        <w:t>t0</w:t>
+      </w:r>
+      <w:r>
+        <w:rPr>
+          <w:lang w:val="es-ES"/>
+        </w:rPr>
+        <w:t xml:space="preserve"> el valor </w:t>
+      </w:r>
+      <w:r>
+        <w:rPr>
+          <w:rStyle w:val="codiinline"/>
+          <w:b w:val="0"/>
+          <w:bCs/>
+        </w:rPr>
+        <w:t>0x</w:t>
+      </w:r>
+      <w:r>
+        <w:rPr>
+          <w:rStyle w:val="codiinline"/>
+          <w:b w:val="0"/>
+          <w:bCs/>
+        </w:rPr>
+        <w:t>1</w:t>
+      </w:r>
+      <w:r>
+        <w:rPr>
+          <w:rStyle w:val="codiinline"/>
+          <w:b w:val="0"/>
+          <w:bCs/>
+        </w:rPr>
+        <w:t>000</w:t>
+      </w:r>
+      <w:r>
+        <w:rPr>
+          <w:rStyle w:val="codiinline"/>
+          <w:b w:val="0"/>
+          <w:bCs/>
+        </w:rPr>
+        <w:t>0</w:t>
+      </w:r>
+      <w:r>
+        <w:rPr>
+          <w:rStyle w:val="codiinline"/>
+          <w:b w:val="0"/>
+          <w:bCs/>
+        </w:rPr>
+        <w:t>000</w:t>
+      </w:r>
+      <w:r>
+        <w:rPr>
+          <w:lang w:val="es-ES"/>
+        </w:rPr>
+        <w:t xml:space="preserve">, que es la dirección de memoria principal correspondiente a la etiqueta llamada </w:t>
+      </w:r>
+      <w:r>
+        <w:rPr>
+          <w:rStyle w:val="codiinline"/>
+          <w:b w:val="0"/>
+          <w:bCs/>
+        </w:rPr>
+        <w:t>aux</w:t>
+      </w:r>
+      <w:r>
+        <w:rPr>
+          <w:rStyle w:val="codiinline"/>
+          <w:b w:val="0"/>
+          <w:bCs/>
+        </w:rPr>
+        <w:t>,</w:t>
+      </w:r>
+      <w:r>
+        <w:t xml:space="preserve"> </w:t>
+      </w:r>
+      <w:r>
+        <w:rPr>
+          <w:lang w:val="es-ES"/>
+        </w:rPr>
+        <w:t xml:space="preserve">que viene definida como un entero con signo de valor -1 (en hexadecimal, </w:t>
+      </w:r>
+      <w:r>
+        <w:rPr>
+          <w:rStyle w:val="codiinline"/>
+          <w:b w:val="0"/>
+          <w:bCs/>
+        </w:rPr>
+        <w:t>0xFFFFFFFF</w:t>
+      </w:r>
+      <w:r>
+        <w:rPr>
+          <w:lang w:val="es-ES"/>
+        </w:rPr>
+        <w:t>)</w:t>
+      </w:r>
+      <w:r>
+        <w:rPr>
+          <w:lang w:val="es-ES"/>
+        </w:rPr>
+        <w:t>.</w:t>
+      </w:r>
+      <w:r>
+        <w:rPr>
+          <w:lang w:val="es-ES"/>
+        </w:rPr>
+        <w:t xml:space="preserve"> </w:t>
+      </w:r>
+      <w:r>
+        <w:rPr>
+          <w:lang w:val="es-ES"/>
+        </w:rPr>
+        <w:t>P</w:t>
+      </w:r>
+      <w:r>
+        <w:rPr>
+          <w:lang w:val="es-ES"/>
+        </w:rPr>
+        <w:t>or otra parte, la pseudoinstrucció</w:t>
+      </w:r>
+      <w:r>
+        <w:rPr>
+          <w:lang w:val="es-ES"/>
+        </w:rPr>
+        <w:t>n</w:t>
+      </w:r>
+      <w:r>
+        <w:rPr>
+          <w:lang w:val="es-ES"/>
+        </w:rPr>
+        <w:t xml:space="preserve"> </w:t>
+      </w:r>
+      <w:r>
+        <w:rPr>
+          <w:rStyle w:val="codiinline"/>
+          <w:b w:val="0"/>
+          <w:bCs/>
+          <w:lang w:val="es-ES"/>
+        </w:rPr>
+        <w:t xml:space="preserve">la </w:t>
+      </w:r>
+      <w:r>
+        <w:rPr>
+          <w:rStyle w:val="codiinline"/>
+          <w:b w:val="0"/>
+          <w:bCs/>
+          <w:lang w:val="es-ES"/>
+        </w:rPr>
+        <w:t>x1</w:t>
+      </w:r>
+      <w:r>
+        <w:rPr>
+          <w:rStyle w:val="codiinline"/>
+          <w:b w:val="0"/>
+          <w:bCs/>
+          <w:lang w:val="es-ES"/>
+        </w:rPr>
+        <w:t>,cadena</w:t>
+      </w:r>
+      <w:r>
+        <w:rPr>
+          <w:lang w:val="es-ES"/>
+        </w:rPr>
+        <w:t xml:space="preserve"> copiará en </w:t>
+      </w:r>
+      <w:r>
+        <w:rPr>
+          <w:rStyle w:val="codiinline"/>
+          <w:b w:val="0"/>
+          <w:bCs/>
+          <w:lang w:val="es-ES"/>
+        </w:rPr>
+        <w:t>t1</w:t>
+      </w:r>
+      <w:r>
+        <w:rPr>
+          <w:lang w:val="es-ES"/>
+        </w:rPr>
+        <w:t xml:space="preserve"> el valor </w:t>
+      </w:r>
+      <w:r>
+        <w:rPr>
+          <w:rStyle w:val="codiinline"/>
+          <w:b w:val="0"/>
+          <w:bCs/>
+        </w:rPr>
+        <w:t>0x</w:t>
+      </w:r>
+      <w:r>
+        <w:rPr>
+          <w:rStyle w:val="codiinline"/>
+          <w:b w:val="0"/>
+          <w:bCs/>
+        </w:rPr>
+        <w:t>1</w:t>
+      </w:r>
+      <w:r>
+        <w:rPr>
+          <w:rStyle w:val="codiinline"/>
+          <w:b w:val="0"/>
+          <w:bCs/>
+        </w:rPr>
+        <w:t>000</w:t>
+      </w:r>
+      <w:r>
+        <w:rPr>
+          <w:rStyle w:val="codiinline"/>
+          <w:b w:val="0"/>
+          <w:bCs/>
+        </w:rPr>
+        <w:t>0</w:t>
+      </w:r>
+      <w:r>
+        <w:rPr>
+          <w:rStyle w:val="codiinline"/>
+          <w:b w:val="0"/>
+          <w:bCs/>
+        </w:rPr>
+        <w:t>00</w:t>
+      </w:r>
+      <w:r>
+        <w:rPr>
+          <w:rStyle w:val="codiinline"/>
+          <w:b w:val="0"/>
+          <w:bCs/>
+        </w:rPr>
+        <w:t>4</w:t>
+      </w:r>
+      <w:r>
+        <w:rPr>
+          <w:lang w:val="es-ES"/>
+        </w:rPr>
+        <w:t xml:space="preserve">, que corresponde a la dirección donde se almacena el código ASCII del carácter </w:t>
+      </w:r>
+      <w:r>
+        <w:rPr>
+          <w:rStyle w:val="codiinline"/>
+          <w:bCs/>
+        </w:rPr>
+        <w:t>“</w:t>
+      </w:r>
+      <w:r>
+        <w:rPr>
+          <w:rStyle w:val="codiinline"/>
+          <w:b w:val="0"/>
+          <w:bCs/>
+        </w:rPr>
+        <w:t>H</w:t>
+      </w:r>
+      <w:r>
+        <w:rPr>
+          <w:rStyle w:val="codiinline"/>
+          <w:bCs/>
+        </w:rPr>
+        <w:t>”</w:t>
+      </w:r>
+      <w:r>
+        <w:rPr>
+          <w:lang w:val="es-ES"/>
+        </w:rPr>
+        <w:t xml:space="preserve"> de la cadena </w:t>
+      </w:r>
+      <w:r>
+        <w:rPr>
+          <w:rStyle w:val="codiinline"/>
+          <w:b w:val="0"/>
+        </w:rPr>
+        <w:t>“Hola mundo”</w:t>
+      </w:r>
+      <w:r>
+        <w:rPr>
+          <w:lang w:val="es-ES"/>
+        </w:rPr>
+        <w:t xml:space="preserve">. </w:t>
+      </w:r>
+    </w:p>
+    <w:p>
+      <w:pPr>
+        <w:pStyle w:val="Pargraf"/>
+        <w:spacing w:line="240" w:lineRule="auto"/>
+        <w:rPr>
+          <w:lang w:val="es-ES"/>
+        </w:rPr>
+      </w:pPr>
+      <w:r>
+        <w:rPr>
+          <w:lang w:val="es-ES"/>
+        </w:rPr>
+        <w:t xml:space="preserve">En </w:t>
+      </w:r>
+      <w:r>
+        <w:rPr>
+          <w:lang w:val="es-ES"/>
+        </w:rPr>
+        <w:t xml:space="preserve">RISC-V, el segmento de datos no reside en una dirección de memoria prefijada por el programador. Esa dirección, tal y como ocurre, en el mundo real, se fija cuando el sistema operativo (SO) carga el programa en memoria para su ejecución. Como consecuencia, la pseudoinstrucción </w:t>
+      </w:r>
+      <w:r>
+        <w:rPr>
+          <w:rFonts w:ascii="Courier New" w:hAnsi="Courier New" w:cs="Courier New"/>
+          <w:lang w:val="es-ES"/>
+        </w:rPr>
+        <w:t>la</w:t>
+      </w:r>
+      <w:r>
+        <w:rPr>
+          <w:lang w:val="es-ES"/>
+        </w:rPr>
+        <w:t xml:space="preserve"> se traduce</w:t>
+      </w:r>
+      <w:r>
+        <w:rPr>
+          <w:lang w:val="es-ES"/>
+        </w:rPr>
+        <w:t xml:space="preserve"> la instrucci</w:t>
+      </w:r>
+      <w:r>
+        <w:rPr>
+          <w:lang w:val="es-ES"/>
+        </w:rPr>
+        <w:t>ón</w:t>
+      </w:r>
+      <w:r>
+        <w:rPr>
+          <w:lang w:val="es-ES"/>
+        </w:rPr>
+        <w:t xml:space="preserve"> </w:t>
+      </w:r>
+      <w:r>
+        <w:rPr>
+          <w:rFonts w:ascii="Courier New" w:hAnsi="Courier New" w:cs="Courier New"/>
+          <w:lang w:val="es-ES"/>
+        </w:rPr>
+        <w:t>auipc</w:t>
+      </w:r>
+      <w:r>
+        <w:rPr>
+          <w:lang w:val="es-ES"/>
+        </w:rPr>
+        <w:t xml:space="preserve"> (</w:t>
+      </w:r>
+      <w:r>
+        <w:rPr>
+          <w:i/>
+          <w:iCs/>
+          <w:lang w:val="es-ES"/>
+        </w:rPr>
+        <w:t>a</w:t>
+      </w:r>
+      <w:r>
+        <w:rPr>
+          <w:i/>
+          <w:iCs/>
+          <w:lang w:val="es-ES"/>
+        </w:rPr>
+        <w:t xml:space="preserve">dd </w:t>
+      </w:r>
+      <w:r>
+        <w:rPr>
+          <w:i/>
+          <w:iCs/>
+          <w:lang w:val="es-ES"/>
+        </w:rPr>
+        <w:t>u</w:t>
+      </w:r>
+      <w:r>
+        <w:rPr>
+          <w:i/>
+          <w:iCs/>
+          <w:lang w:val="es-ES"/>
+        </w:rPr>
+        <w:t xml:space="preserve">pper </w:t>
+      </w:r>
+      <w:r>
+        <w:rPr>
+          <w:i/>
+          <w:iCs/>
+          <w:lang w:val="es-ES"/>
+        </w:rPr>
+        <w:t>i</w:t>
+      </w:r>
+      <w:r>
+        <w:rPr>
+          <w:i/>
+          <w:iCs/>
+          <w:lang w:val="es-ES"/>
+        </w:rPr>
+        <w:t>nmediate to PC</w:t>
+      </w:r>
+      <w:r>
+        <w:rPr>
+          <w:lang w:val="es-ES"/>
+        </w:rPr>
+        <w:t>), que utiliza un modo de direccionamiento relativo al PC. Esta</w:t>
+      </w:r>
+      <w:r>
+        <w:rPr>
+          <w:lang w:val="es-ES"/>
+        </w:rPr>
+        <w:t xml:space="preserve"> </w:t>
+      </w:r>
+      <w:r>
+        <w:rPr>
+          <w:lang w:val="es-ES"/>
+        </w:rPr>
+        <w:t>instrucción asigna al registro de destino el resultado de sumar al PC el contenido de su operando inmediato (de 12 bits) extendido a 20 bits.</w:t>
+      </w:r>
+      <w:r>
+        <w:rPr>
+          <w:lang w:val="es-ES"/>
+        </w:rPr>
+        <w:t xml:space="preserve"> Consideremos este ejemplo:</w:t>
       </w:r>
     </w:p>
     <w:p>
@@ -4588,6 +5255,7 @@
           <w:sz w:val="18"/>
           <w:lang w:val="ca-ES"/>
         </w:rPr>
+        <w:lastRenderedPageBreak/>
         <w:t xml:space="preserve">        </w:t>
       </w:r>
       <w:r>
@@ -4637,37 +5305,24 @@
         <w:rPr>
           <w:rStyle w:val="codiinline"/>
           <w:bCs/>
-        </w:rPr>
-      </w:pPr>
-      <w:r>
-        <w:rPr>
-          <w:rStyle w:val="codiinline"/>
-          <w:bCs/>
           <w:lang w:val="ca-ES"/>
         </w:rPr>
-        <w:t xml:space="preserve">cadena: </w:t>
-      </w:r>
-      <w:commentRangeStart w:id="2"/>
+      </w:pPr>
       <w:r>
         <w:rPr>
           <w:rStyle w:val="codiinline"/>
           <w:bCs/>
           <w:lang w:val="ca-ES"/>
         </w:rPr>
-        <w:t xml:space="preserve">.asciz </w:t>
-      </w:r>
-      <w:commentRangeEnd w:id="2"/>
-      <w:r>
-        <w:rPr>
-          <w:rStyle w:val="Refdecomentario"/>
-          <w:b w:val="0"/>
-          <w:bCs/>
-          <w:w w:val="80"/>
-          <w:sz w:val="24"/>
-          <w:szCs w:val="24"/>
+        <w:t xml:space="preserve">cadena: .asciz </w:t>
+      </w:r>
+      <w:r>
+        <w:rPr>
+          <w:rStyle w:val="codiinline"/>
+          <w:bCs/>
           <w:lang w:val="ca-ES"/>
         </w:rPr>
-        <w:commentReference w:id="2"/>
+        <w:t>“</w:t>
       </w:r>
       <w:r>
         <w:rPr>
@@ -4675,555 +5330,7 @@
           <w:bCs/>
           <w:lang w:val="ca-ES"/>
         </w:rPr>
-        <w:t>“</w:t>
-      </w:r>
-      <w:r>
-        <w:rPr>
-          <w:rStyle w:val="codiinline"/>
-          <w:bCs/>
-          <w:lang w:val="ca-ES"/>
-        </w:rPr>
         <w:t>Hola mundo”</w:t>
-      </w:r>
-    </w:p>
-    <w:p>
-      <w:pPr>
-        <w:pStyle w:val="Pargraf"/>
-        <w:ind w:left="708"/>
-        <w:rPr>
-          <w:lang w:val="es-ES"/>
-        </w:rPr>
-      </w:pPr>
-      <w:r>
-        <w:rPr>
-          <w:lang w:val="es-ES"/>
-        </w:rPr>
-        <w:t xml:space="preserve">y el segmento de datos empieza en la dirección </w:t>
-      </w:r>
-      <w:r>
-        <w:rPr>
-          <w:rStyle w:val="codiinline"/>
-          <w:b w:val="0"/>
-          <w:bCs/>
-        </w:rPr>
-        <w:t>0x</w:t>
-      </w:r>
-      <w:r>
-        <w:rPr>
-          <w:rStyle w:val="codiinline"/>
-          <w:b w:val="0"/>
-          <w:bCs/>
-        </w:rPr>
-        <w:t>1</w:t>
-      </w:r>
-      <w:r>
-        <w:rPr>
-          <w:rStyle w:val="codiinline"/>
-          <w:b w:val="0"/>
-          <w:bCs/>
-        </w:rPr>
-        <w:t>000</w:t>
-      </w:r>
-      <w:r>
-        <w:rPr>
-          <w:rStyle w:val="codiinline"/>
-          <w:b w:val="0"/>
-          <w:bCs/>
-        </w:rPr>
-        <w:t>0</w:t>
-      </w:r>
-      <w:r>
-        <w:rPr>
-          <w:rStyle w:val="codiinline"/>
-          <w:b w:val="0"/>
-          <w:bCs/>
-        </w:rPr>
-        <w:t>000</w:t>
-      </w:r>
-      <w:r>
-        <w:rPr>
-          <w:rStyle w:val="codiinline"/>
-        </w:rPr>
-        <w:t xml:space="preserve">, </w:t>
-      </w:r>
-      <w:r>
-        <w:rPr>
-          <w:lang w:val="es-ES"/>
-        </w:rPr>
-        <w:t xml:space="preserve">la pseudoinstrucción </w:t>
-      </w:r>
-      <w:r>
-        <w:rPr>
-          <w:rStyle w:val="codiinline"/>
-          <w:b w:val="0"/>
-          <w:bCs/>
-          <w:lang w:val="es-ES"/>
-        </w:rPr>
-        <w:t xml:space="preserve">la </w:t>
-      </w:r>
-      <w:r>
-        <w:rPr>
-          <w:rStyle w:val="codiinline"/>
-          <w:b w:val="0"/>
-          <w:bCs/>
-          <w:lang w:val="es-ES"/>
-        </w:rPr>
-        <w:t>t</w:t>
-      </w:r>
-      <w:r>
-        <w:rPr>
-          <w:rStyle w:val="codiinline"/>
-          <w:b w:val="0"/>
-          <w:bCs/>
-          <w:lang w:val="es-ES"/>
-        </w:rPr>
-        <w:t>0</w:t>
-      </w:r>
-      <w:r>
-        <w:rPr>
-          <w:rStyle w:val="codiinline"/>
-          <w:b w:val="0"/>
-          <w:bCs/>
-          <w:lang w:val="es-ES"/>
-        </w:rPr>
-        <w:t>,</w:t>
-      </w:r>
-      <w:r>
-        <w:rPr>
-          <w:rStyle w:val="codiinline"/>
-          <w:b w:val="0"/>
-          <w:bCs/>
-          <w:lang w:val="es-ES"/>
-        </w:rPr>
-        <w:t>aux</w:t>
-      </w:r>
-      <w:r>
-        <w:rPr>
-          <w:lang w:val="es-ES"/>
-        </w:rPr>
-        <w:t xml:space="preserve"> copiará en </w:t>
-      </w:r>
-      <w:r>
-        <w:rPr>
-          <w:rStyle w:val="codiinline"/>
-          <w:b w:val="0"/>
-          <w:bCs/>
-          <w:lang w:val="es-ES"/>
-        </w:rPr>
-        <w:t>t0</w:t>
-      </w:r>
-      <w:r>
-        <w:rPr>
-          <w:lang w:val="es-ES"/>
-        </w:rPr>
-        <w:t xml:space="preserve"> el valor </w:t>
-      </w:r>
-      <w:r>
-        <w:rPr>
-          <w:rStyle w:val="codiinline"/>
-          <w:b w:val="0"/>
-          <w:bCs/>
-        </w:rPr>
-        <w:t>0x</w:t>
-      </w:r>
-      <w:r>
-        <w:rPr>
-          <w:rStyle w:val="codiinline"/>
-          <w:b w:val="0"/>
-          <w:bCs/>
-        </w:rPr>
-        <w:t>1</w:t>
-      </w:r>
-      <w:r>
-        <w:rPr>
-          <w:rStyle w:val="codiinline"/>
-          <w:b w:val="0"/>
-          <w:bCs/>
-        </w:rPr>
-        <w:t>000</w:t>
-      </w:r>
-      <w:r>
-        <w:rPr>
-          <w:rStyle w:val="codiinline"/>
-          <w:b w:val="0"/>
-          <w:bCs/>
-        </w:rPr>
-        <w:t>0</w:t>
-      </w:r>
-      <w:r>
-        <w:rPr>
-          <w:rStyle w:val="codiinline"/>
-          <w:b w:val="0"/>
-          <w:bCs/>
-        </w:rPr>
-        <w:t>000</w:t>
-      </w:r>
-      <w:r>
-        <w:rPr>
-          <w:lang w:val="es-ES"/>
-        </w:rPr>
-        <w:t xml:space="preserve">, que es la dirección de memoria principal correspondiente a la etiqueta llamada </w:t>
-      </w:r>
-      <w:r>
-        <w:rPr>
-          <w:rStyle w:val="codiinline"/>
-          <w:b w:val="0"/>
-          <w:bCs/>
-        </w:rPr>
-        <w:t>aux</w:t>
-      </w:r>
-      <w:r>
-        <w:rPr>
-          <w:rStyle w:val="codiinline"/>
-          <w:b w:val="0"/>
-          <w:bCs/>
-        </w:rPr>
-        <w:t>,</w:t>
-      </w:r>
-      <w:r>
-        <w:t xml:space="preserve"> </w:t>
-      </w:r>
-      <w:r>
-        <w:rPr>
-          <w:lang w:val="es-ES"/>
-        </w:rPr>
-        <w:t xml:space="preserve">que viene definida como un entero con signo de valor -1 (en hexadecimal, </w:t>
-      </w:r>
-      <w:r>
-        <w:rPr>
-          <w:rStyle w:val="codiinline"/>
-          <w:b w:val="0"/>
-          <w:bCs/>
-        </w:rPr>
-        <w:t>0xFFFFFFFF</w:t>
-      </w:r>
-      <w:r>
-        <w:rPr>
-          <w:lang w:val="es-ES"/>
-        </w:rPr>
-        <w:t>)</w:t>
-      </w:r>
-      <w:r>
-        <w:rPr>
-          <w:lang w:val="es-ES"/>
-        </w:rPr>
-        <w:t>.</w:t>
-      </w:r>
-      <w:r>
-        <w:rPr>
-          <w:lang w:val="es-ES"/>
-        </w:rPr>
-        <w:t xml:space="preserve"> </w:t>
-      </w:r>
-      <w:r>
-        <w:rPr>
-          <w:lang w:val="es-ES"/>
-        </w:rPr>
-        <w:t>P</w:t>
-      </w:r>
-      <w:r>
-        <w:rPr>
-          <w:lang w:val="es-ES"/>
-        </w:rPr>
-        <w:t>or otra parte, la pseudoinstrucció</w:t>
-      </w:r>
-      <w:r>
-        <w:rPr>
-          <w:lang w:val="es-ES"/>
-        </w:rPr>
-        <w:t>n</w:t>
-      </w:r>
-      <w:r>
-        <w:rPr>
-          <w:lang w:val="es-ES"/>
-        </w:rPr>
-        <w:t xml:space="preserve"> </w:t>
-      </w:r>
-      <w:r>
-        <w:rPr>
-          <w:rStyle w:val="codiinline"/>
-          <w:b w:val="0"/>
-          <w:bCs/>
-          <w:lang w:val="es-ES"/>
-        </w:rPr>
-        <w:t xml:space="preserve">la </w:t>
-      </w:r>
-      <w:r>
-        <w:rPr>
-          <w:rStyle w:val="codiinline"/>
-          <w:b w:val="0"/>
-          <w:bCs/>
-          <w:lang w:val="es-ES"/>
-        </w:rPr>
-        <w:t>x1</w:t>
-      </w:r>
-      <w:r>
-        <w:rPr>
-          <w:rStyle w:val="codiinline"/>
-          <w:b w:val="0"/>
-          <w:bCs/>
-          <w:lang w:val="es-ES"/>
-        </w:rPr>
-        <w:t>,cadena</w:t>
-      </w:r>
-      <w:r>
-        <w:rPr>
-          <w:lang w:val="es-ES"/>
-        </w:rPr>
-        <w:t xml:space="preserve"> copiará en </w:t>
-      </w:r>
-      <w:r>
-        <w:rPr>
-          <w:rStyle w:val="codiinline"/>
-          <w:b w:val="0"/>
-          <w:bCs/>
-          <w:lang w:val="es-ES"/>
-        </w:rPr>
-        <w:t>t1</w:t>
-      </w:r>
-      <w:r>
-        <w:rPr>
-          <w:lang w:val="es-ES"/>
-        </w:rPr>
-        <w:t xml:space="preserve"> el valor </w:t>
-      </w:r>
-      <w:r>
-        <w:rPr>
-          <w:rStyle w:val="codiinline"/>
-          <w:b w:val="0"/>
-          <w:bCs/>
-        </w:rPr>
-        <w:t>0x</w:t>
-      </w:r>
-      <w:r>
-        <w:rPr>
-          <w:rStyle w:val="codiinline"/>
-          <w:b w:val="0"/>
-          <w:bCs/>
-        </w:rPr>
-        <w:t>1</w:t>
-      </w:r>
-      <w:r>
-        <w:rPr>
-          <w:rStyle w:val="codiinline"/>
-          <w:b w:val="0"/>
-          <w:bCs/>
-        </w:rPr>
-        <w:t>000</w:t>
-      </w:r>
-      <w:r>
-        <w:rPr>
-          <w:rStyle w:val="codiinline"/>
-          <w:b w:val="0"/>
-          <w:bCs/>
-        </w:rPr>
-        <w:t>0</w:t>
-      </w:r>
-      <w:r>
-        <w:rPr>
-          <w:rStyle w:val="codiinline"/>
-          <w:b w:val="0"/>
-          <w:bCs/>
-        </w:rPr>
-        <w:t>00</w:t>
-      </w:r>
-      <w:r>
-        <w:rPr>
-          <w:rStyle w:val="codiinline"/>
-          <w:b w:val="0"/>
-          <w:bCs/>
-        </w:rPr>
-        <w:t>4</w:t>
-      </w:r>
-      <w:r>
-        <w:rPr>
-          <w:lang w:val="es-ES"/>
-        </w:rPr>
-        <w:t xml:space="preserve">, que corresponde a la dirección donde se almacena el código ASCII del carácter </w:t>
-      </w:r>
-      <w:r>
-        <w:rPr>
-          <w:rStyle w:val="codiinline"/>
-          <w:bCs/>
-        </w:rPr>
-        <w:t>“</w:t>
-      </w:r>
-      <w:r>
-        <w:rPr>
-          <w:rStyle w:val="codiinline"/>
-          <w:b w:val="0"/>
-          <w:bCs/>
-        </w:rPr>
-        <w:t>H</w:t>
-      </w:r>
-      <w:r>
-        <w:rPr>
-          <w:rStyle w:val="codiinline"/>
-          <w:bCs/>
-        </w:rPr>
-        <w:t>”</w:t>
-      </w:r>
-      <w:r>
-        <w:rPr>
-          <w:lang w:val="es-ES"/>
-        </w:rPr>
-        <w:t xml:space="preserve"> de la cadena </w:t>
-      </w:r>
-      <w:r>
-        <w:rPr>
-          <w:rStyle w:val="codiinline"/>
-          <w:b w:val="0"/>
-        </w:rPr>
-        <w:t>“Hola mundo”</w:t>
-      </w:r>
-      <w:r>
-        <w:rPr>
-          <w:lang w:val="es-ES"/>
-        </w:rPr>
-        <w:t xml:space="preserve">. </w:t>
-      </w:r>
-    </w:p>
-    <w:p>
-      <w:pPr>
-        <w:pStyle w:val="Pargraf"/>
-        <w:rPr>
-          <w:lang w:val="es-ES"/>
-        </w:rPr>
-      </w:pPr>
-      <w:r>
-        <w:rPr>
-          <w:lang w:val="es-ES"/>
-        </w:rPr>
-        <w:t xml:space="preserve">En </w:t>
-      </w:r>
-      <w:r>
-        <w:rPr>
-          <w:lang w:val="es-ES"/>
-        </w:rPr>
-        <w:t xml:space="preserve">RISC-V, el segmento de datos no reside en una dirección de memoria prefijada por el programador. Esa dirección, tal y como ocurre, en el mundo real, se fija cuando el sistema </w:t>
-      </w:r>
-      <w:r>
-        <w:rPr>
-          <w:lang w:val="es-ES"/>
-        </w:rPr>
-        <w:lastRenderedPageBreak/>
-        <w:t xml:space="preserve">operativo (SO) carga el programa en memoria para su ejecución. Como consecuencia, la pseudoinstrucción </w:t>
-      </w:r>
-      <w:r>
-        <w:rPr>
-          <w:rFonts w:ascii="Courier New" w:hAnsi="Courier New" w:cs="Courier New"/>
-          <w:lang w:val="es-ES"/>
-        </w:rPr>
-        <w:t>la</w:t>
-      </w:r>
-      <w:r>
-        <w:rPr>
-          <w:lang w:val="es-ES"/>
-        </w:rPr>
-        <w:t xml:space="preserve"> se traduce</w:t>
-      </w:r>
-      <w:r>
-        <w:rPr>
-          <w:lang w:val="es-ES"/>
-        </w:rPr>
-        <w:t xml:space="preserve"> la instrucci</w:t>
-      </w:r>
-      <w:r>
-        <w:rPr>
-          <w:lang w:val="es-ES"/>
-        </w:rPr>
-        <w:t>ón</w:t>
-      </w:r>
-      <w:r>
-        <w:rPr>
-          <w:lang w:val="es-ES"/>
-        </w:rPr>
-        <w:t xml:space="preserve"> </w:t>
-      </w:r>
-      <w:r>
-        <w:rPr>
-          <w:rFonts w:ascii="Courier New" w:hAnsi="Courier New" w:cs="Courier New"/>
-          <w:lang w:val="es-ES"/>
-        </w:rPr>
-        <w:t>auipc</w:t>
-      </w:r>
-      <w:r>
-        <w:rPr>
-          <w:lang w:val="es-ES"/>
-        </w:rPr>
-        <w:t xml:space="preserve"> (</w:t>
-      </w:r>
-      <w:r>
-        <w:rPr>
-          <w:i/>
-          <w:iCs/>
-          <w:lang w:val="es-ES"/>
-        </w:rPr>
-        <w:t>a</w:t>
-      </w:r>
-      <w:r>
-        <w:rPr>
-          <w:i/>
-          <w:iCs/>
-          <w:lang w:val="es-ES"/>
-        </w:rPr>
-        <w:t xml:space="preserve">dd </w:t>
-      </w:r>
-      <w:r>
-        <w:rPr>
-          <w:i/>
-          <w:iCs/>
-          <w:lang w:val="es-ES"/>
-        </w:rPr>
-        <w:t>u</w:t>
-      </w:r>
-      <w:r>
-        <w:rPr>
-          <w:i/>
-          <w:iCs/>
-          <w:lang w:val="es-ES"/>
-        </w:rPr>
-        <w:t xml:space="preserve">pper </w:t>
-      </w:r>
-      <w:r>
-        <w:rPr>
-          <w:i/>
-          <w:iCs/>
-          <w:lang w:val="es-ES"/>
-        </w:rPr>
-        <w:t>i</w:t>
-      </w:r>
-      <w:r>
-        <w:rPr>
-          <w:i/>
-          <w:iCs/>
-          <w:lang w:val="es-ES"/>
-        </w:rPr>
-        <w:t>nmediate to PC</w:t>
-      </w:r>
-      <w:r>
-        <w:rPr>
-          <w:lang w:val="es-ES"/>
-        </w:rPr>
-        <w:t>), que utiliza un modo de direccionamiento relativo al PC. Esta</w:t>
-      </w:r>
-      <w:r>
-        <w:rPr>
-          <w:lang w:val="es-ES"/>
-        </w:rPr>
-        <w:t xml:space="preserve"> </w:t>
-      </w:r>
-      <w:r>
-        <w:rPr>
-          <w:lang w:val="es-ES"/>
-        </w:rPr>
-        <w:t>instrucción asigna al registro de destino el resultado de sumar al PC el contenido de su operando inmediato (de 12 bits) extendido a 20 bits.</w:t>
-      </w:r>
-      <w:r>
-        <w:rPr>
-          <w:lang w:val="es-ES"/>
-        </w:rPr>
-        <w:t xml:space="preserve"> Consideremos este ejemplo:</w:t>
       </w:r>
     </w:p>
     <w:p>
@@ -5238,32 +5345,6 @@
           <w:lang w:val="ca-ES"/>
         </w:rPr>
       </w:pPr>
-      <w:r>
-        <w:rPr>
-          <w:rStyle w:val="codiinline"/>
-          <w:b/>
-          <w:sz w:val="18"/>
-          <w:lang w:val="ca-ES"/>
-        </w:rPr>
-        <w:t xml:space="preserve">        </w:t>
-      </w:r>
-      <w:r>
-        <w:rPr>
-          <w:rStyle w:val="codiinline"/>
-          <w:b/>
-          <w:sz w:val="18"/>
-          <w:lang w:val="ca-ES"/>
-        </w:rPr>
-        <w:t xml:space="preserve">   </w:t>
-      </w:r>
-      <w:r>
-        <w:rPr>
-          <w:rStyle w:val="codiinline"/>
-          <w:bCs/>
-          <w:lang w:val="ca-ES"/>
-        </w:rPr>
-        <w:t>.data</w:t>
-      </w:r>
     </w:p>
     <w:p>
       <w:pPr>
@@ -5274,15 +5355,16 @@
         <w:rPr>
           <w:rStyle w:val="codiinline"/>
           <w:bCs/>
-        </w:rPr>
-      </w:pPr>
-      <w:r>
-        <w:rPr>
-          <w:rStyle w:val="codiinline"/>
-          <w:bCs/>
           <w:lang w:val="ca-ES"/>
         </w:rPr>
-        <w:t>aux:    .word -1</w:t>
+      </w:pPr>
+      <w:r>
+        <w:rPr>
+          <w:rStyle w:val="codiinline"/>
+          <w:bCs/>
+          <w:lang w:val="ca-ES"/>
+        </w:rPr>
+        <w:t xml:space="preserve">        .text</w:t>
       </w:r>
     </w:p>
     <w:p>
@@ -5303,23 +5385,7 @@
           <w:bCs/>
           <w:lang w:val="ca-ES"/>
         </w:rPr>
-        <w:t xml:space="preserve">cadena: .asciz </w:t>
-      </w:r>
-      <w:r>
-        <w:rPr>
-          <w:rStyle w:val="codiinline"/>
-          <w:bCs/>
-          <w:lang w:val="ca-ES"/>
-        </w:rPr>
-        <w:t>“</w:t>
-      </w:r>
-      <w:r>
-        <w:rPr>
-          <w:rStyle w:val="codiinline"/>
-          <w:bCs/>
-          <w:lang w:val="ca-ES"/>
-        </w:rPr>
-        <w:t>Hola mundo”</w:t>
+        <w:t>la      t1,aux</w:t>
       </w:r>
     </w:p>
     <w:p>
@@ -5331,69 +5397,14 @@
         <w:rPr>
           <w:rStyle w:val="codiinline"/>
           <w:bCs/>
+        </w:rPr>
+      </w:pPr>
+      <w:r>
+        <w:rPr>
+          <w:rStyle w:val="codiinline"/>
+          <w:bCs/>
           <w:lang w:val="ca-ES"/>
         </w:rPr>
-      </w:pPr>
-    </w:p>
-    <w:p>
-      <w:pPr>
-        <w:pStyle w:val="Codi"/>
-        <w:spacing w:line="240" w:lineRule="atLeast"/>
-        <w:ind w:left="2832" w:right="2262"/>
-        <w:jc w:val="left"/>
-        <w:rPr>
-          <w:rStyle w:val="codiinline"/>
-          <w:bCs/>
-          <w:lang w:val="ca-ES"/>
-        </w:rPr>
-      </w:pPr>
-      <w:r>
-        <w:rPr>
-          <w:rStyle w:val="codiinline"/>
-          <w:bCs/>
-          <w:lang w:val="ca-ES"/>
-        </w:rPr>
-        <w:t xml:space="preserve">        .text</w:t>
-      </w:r>
-    </w:p>
-    <w:p>
-      <w:pPr>
-        <w:pStyle w:val="Codi"/>
-        <w:spacing w:line="240" w:lineRule="atLeast"/>
-        <w:ind w:left="2832" w:right="2262"/>
-        <w:jc w:val="left"/>
-        <w:rPr>
-          <w:rStyle w:val="codiinline"/>
-          <w:bCs/>
-          <w:lang w:val="ca-ES"/>
-        </w:rPr>
-      </w:pPr>
-      <w:r>
-        <w:rPr>
-          <w:rStyle w:val="codiinline"/>
-          <w:bCs/>
-          <w:lang w:val="ca-ES"/>
-        </w:rPr>
-        <w:t>la      t1,aux</w:t>
-      </w:r>
-    </w:p>
-    <w:p>
-      <w:pPr>
-        <w:pStyle w:val="Codi"/>
-        <w:spacing w:line="240" w:lineRule="atLeast"/>
-        <w:ind w:left="2832" w:right="2262"/>
-        <w:jc w:val="left"/>
-        <w:rPr>
-          <w:rStyle w:val="codiinline"/>
-          <w:bCs/>
-        </w:rPr>
-      </w:pPr>
-      <w:r>
-        <w:rPr>
-          <w:rStyle w:val="codiinline"/>
-          <w:bCs/>
-          <w:lang w:val="ca-ES"/>
-        </w:rPr>
         <w:t>la      t2,cadena</w:t>
       </w:r>
     </w:p>
@@ -5408,6 +5419,7 @@
     <w:p>
       <w:pPr>
         <w:pStyle w:val="Pargraf"/>
+        <w:spacing w:line="240" w:lineRule="auto"/>
         <w:rPr>
           <w:lang w:val="es-ES"/>
         </w:rPr>
@@ -5570,23 +5582,7 @@
           <w:bCs/>
           <w:lang w:val="ca-ES"/>
         </w:rPr>
-        <w:t>auipc</w:t>
-      </w:r>
-      <w:r>
-        <w:rPr>
-          <w:rStyle w:val="codiinline"/>
-          <w:bCs/>
-          <w:lang w:val="ca-ES"/>
-        </w:rPr>
-        <w:t xml:space="preserve">   </w:t>
-      </w:r>
-      <w:r>
-        <w:rPr>
-          <w:rStyle w:val="codiinline"/>
-          <w:bCs/>
-          <w:lang w:val="ca-ES"/>
-        </w:rPr>
-        <w:t>x5,0x10000    # la t1,aux (t1 es x5)</w:t>
+        <w:t>auipc   x5,0x10000    # la t1,aux (t1 es x5)</w:t>
       </w:r>
     </w:p>
     <w:p>
@@ -5607,39 +5603,7 @@
           <w:bCs/>
           <w:lang w:val="ca-ES"/>
         </w:rPr>
-        <w:t>addi</w:t>
-      </w:r>
-      <w:r>
-        <w:rPr>
-          <w:rStyle w:val="codiinline"/>
-          <w:bCs/>
-          <w:lang w:val="ca-ES"/>
-        </w:rPr>
-        <w:t xml:space="preserve">    </w:t>
-      </w:r>
-      <w:r>
-        <w:rPr>
-          <w:rStyle w:val="codiinline"/>
-          <w:bCs/>
-          <w:lang w:val="ca-ES"/>
-        </w:rPr>
-        <w:t>x5</w:t>
-      </w:r>
-      <w:r>
-        <w:rPr>
-          <w:rStyle w:val="codiinline"/>
-          <w:bCs/>
-          <w:lang w:val="ca-ES"/>
-        </w:rPr>
-        <w:t>,</w:t>
-      </w:r>
-      <w:r>
-        <w:rPr>
-          <w:rStyle w:val="codiinline"/>
-          <w:bCs/>
-          <w:lang w:val="ca-ES"/>
-        </w:rPr>
-        <w:t>x5,0</w:t>
+        <w:t>addi    x5,x5,0</w:t>
       </w:r>
     </w:p>
     <w:p>
@@ -5702,6 +5666,7 @@
     <w:p>
       <w:pPr>
         <w:pStyle w:val="Pargraf"/>
+        <w:spacing w:line="240" w:lineRule="auto"/>
         <w:rPr>
           <w:lang w:val="es-ES"/>
         </w:rPr>
@@ -5808,6 +5773,7 @@
     <w:p>
       <w:pPr>
         <w:pStyle w:val="Pargraf"/>
+        <w:spacing w:line="240" w:lineRule="auto"/>
         <w:rPr>
           <w:lang w:val="es-ES"/>
         </w:rPr>
@@ -5829,13 +5795,7 @@
         <w:rPr>
           <w:lang w:val="es-ES"/>
         </w:rPr>
-        <w:t xml:space="preserve">, que </w:t>
-      </w:r>
-      <w:r>
-        <w:rPr>
-          <w:lang w:val="es-ES"/>
-        </w:rPr>
-        <w:t xml:space="preserve">está en la dirección de memoria </w:t>
+        <w:t xml:space="preserve">, que está en la dirección de memoria </w:t>
       </w:r>
       <w:r>
         <w:rPr>
@@ -5855,20 +5815,28 @@
         <w:rPr>
           <w:lang w:val="es-ES"/>
         </w:rPr>
+        <w:t xml:space="preserve"> Tras ejecutarla, </w:t>
+      </w:r>
+      <w:r>
+        <w:rPr>
+          <w:rFonts w:ascii="Courier New" w:hAnsi="Courier New" w:cs="Courier New"/>
+          <w:lang w:val="es-ES"/>
+        </w:rPr>
+        <w:t>x5 = PC</w:t>
+      </w:r>
+      <w:r>
+        <w:rPr>
+          <w:rFonts w:ascii="Courier New" w:hAnsi="Courier New" w:cs="Courier New"/>
+          <w:lang w:val="es-ES"/>
+        </w:rPr>
         <w:t xml:space="preserve"> </w:t>
       </w:r>
       <w:r>
         <w:rPr>
-          <w:lang w:val="es-ES"/>
-        </w:rPr>
-        <w:t xml:space="preserve">Tras ejecutarla, </w:t>
-      </w:r>
-      <w:r>
-        <w:rPr>
           <w:rFonts w:ascii="Courier New" w:hAnsi="Courier New" w:cs="Courier New"/>
           <w:lang w:val="es-ES"/>
         </w:rPr>
-        <w:t>x5 = PC</w:t>
+        <w:t>+</w:t>
       </w:r>
       <w:r>
         <w:rPr>
@@ -5882,68 +5850,54 @@
           <w:rFonts w:ascii="Courier New" w:hAnsi="Courier New" w:cs="Courier New"/>
           <w:lang w:val="es-ES"/>
         </w:rPr>
-        <w:t>+</w:t>
+        <w:t>(inm20&lt;&lt;12) = 0x0000000</w:t>
       </w:r>
       <w:r>
         <w:rPr>
           <w:rFonts w:ascii="Courier New" w:hAnsi="Courier New" w:cs="Courier New"/>
           <w:lang w:val="es-ES"/>
         </w:rPr>
-        <w:t xml:space="preserve"> </w:t>
+        <w:t>8</w:t>
       </w:r>
       <w:r>
         <w:rPr>
           <w:rFonts w:ascii="Courier New" w:hAnsi="Courier New" w:cs="Courier New"/>
           <w:lang w:val="es-ES"/>
         </w:rPr>
-        <w:t>(inm20&lt;&lt;12) = 0x0000000</w:t>
+        <w:t xml:space="preserve"> + 0x</w:t>
       </w:r>
       <w:r>
         <w:rPr>
           <w:rFonts w:ascii="Courier New" w:hAnsi="Courier New" w:cs="Courier New"/>
           <w:lang w:val="es-ES"/>
         </w:rPr>
-        <w:t>8</w:t>
+        <w:t>FFFFFFFC</w:t>
       </w:r>
       <w:r>
         <w:rPr>
           <w:rFonts w:ascii="Courier New" w:hAnsi="Courier New" w:cs="Courier New"/>
           <w:lang w:val="es-ES"/>
         </w:rPr>
-        <w:t xml:space="preserve"> + 0x</w:t>
+        <w:t xml:space="preserve"> = 0x1000000</w:t>
       </w:r>
       <w:r>
         <w:rPr>
           <w:rFonts w:ascii="Courier New" w:hAnsi="Courier New" w:cs="Courier New"/>
           <w:lang w:val="es-ES"/>
         </w:rPr>
-        <w:t>FFFFFFFC</w:t>
+        <w:t>4</w:t>
+      </w:r>
+      <w:r>
+        <w:rPr>
+          <w:lang w:val="es-ES"/>
+        </w:rPr>
+        <w:t xml:space="preserve">, que es la dirección de </w:t>
       </w:r>
       <w:r>
         <w:rPr>
           <w:rFonts w:ascii="Courier New" w:hAnsi="Courier New" w:cs="Courier New"/>
           <w:lang w:val="es-ES"/>
         </w:rPr>
-        <w:t xml:space="preserve"> = 0x1000000</w:t>
-      </w:r>
-      <w:r>
-        <w:rPr>
-          <w:rFonts w:ascii="Courier New" w:hAnsi="Courier New" w:cs="Courier New"/>
-          <w:lang w:val="es-ES"/>
-        </w:rPr>
-        <w:t>4</w:t>
-      </w:r>
-      <w:r>
-        <w:rPr>
-          <w:lang w:val="es-ES"/>
-        </w:rPr>
-        <w:t xml:space="preserve">, que es la dirección de </w:t>
-      </w:r>
-      <w:r>
-        <w:rPr>
-          <w:rFonts w:ascii="Courier New" w:hAnsi="Courier New" w:cs="Courier New"/>
-          <w:lang w:val="es-ES"/>
-        </w:rPr>
         <w:t>cadena</w:t>
       </w:r>
       <w:r>
@@ -5976,6 +5930,7 @@
     <w:p>
       <w:pPr>
         <w:pStyle w:val="Pargraf"/>
+        <w:spacing w:line="240" w:lineRule="auto"/>
         <w:rPr>
           <w:lang w:val="es-ES"/>
         </w:rPr>
@@ -6072,6 +6027,7 @@
           <w:ilvl w:val="0"/>
           <w:numId w:val="13"/>
         </w:numPr>
+        <w:spacing w:line="240" w:lineRule="auto"/>
       </w:pPr>
       <w:r>
         <w:t>El segment</w:t>
@@ -6118,6 +6074,7 @@
           <w:ilvl w:val="0"/>
           <w:numId w:val="13"/>
         </w:numPr>
+        <w:spacing w:line="240" w:lineRule="auto"/>
       </w:pPr>
       <w:r>
         <w:t>El segment</w:t>
@@ -6163,9 +6120,9 @@
           <w:ilvl w:val="0"/>
           <w:numId w:val="13"/>
         </w:numPr>
-      </w:pPr>
-      <w:r>
-        <w:lastRenderedPageBreak/>
+        <w:spacing w:line="240" w:lineRule="auto"/>
+      </w:pPr>
+      <w:r>
         <w:t xml:space="preserve">La directiva </w:t>
       </w:r>
       <w:r>
@@ -6220,6 +6177,7 @@
           <w:ilvl w:val="0"/>
           <w:numId w:val="13"/>
         </w:numPr>
+        <w:spacing w:line="240" w:lineRule="auto"/>
       </w:pPr>
       <w:r>
         <w:t>La</w:t>
@@ -6338,6 +6296,7 @@
         <w:rPr>
           <w:lang w:val="es-ES"/>
         </w:rPr>
+        <w:lastRenderedPageBreak/>
         <w:t>Instrucciones</w:t>
       </w:r>
       <w:r>
@@ -6404,6 +6363,7 @@
     <w:p>
       <w:pPr>
         <w:pStyle w:val="Pargraf"/>
+        <w:spacing w:line="240" w:lineRule="auto"/>
         <w:rPr>
           <w:lang w:val="es-ES"/>
         </w:rPr>
@@ -7150,6 +7110,7 @@
     <w:p>
       <w:pPr>
         <w:pStyle w:val="Pargraf"/>
+        <w:spacing w:line="240" w:lineRule="auto"/>
         <w:rPr>
           <w:lang w:val="es-ES"/>
         </w:rPr>
@@ -7556,6 +7517,7 @@
     <w:p>
       <w:pPr>
         <w:pStyle w:val="Pargraf"/>
+        <w:spacing w:line="240" w:lineRule="auto"/>
         <w:rPr>
           <w:lang w:val="es-ES"/>
         </w:rPr>
@@ -8060,6 +8022,7 @@
     <w:p>
       <w:pPr>
         <w:pStyle w:val="Pargraf"/>
+        <w:spacing w:line="240" w:lineRule="auto"/>
         <w:rPr>
           <w:lang w:val="es-ES"/>
         </w:rPr>
@@ -8365,209 +8328,209 @@
         <w:t>ara acceder a variables estructuradas: el registro</w:t>
       </w:r>
       <w:r>
+        <w:t xml:space="preserve"> cont</w:t>
+      </w:r>
+      <w:r>
+        <w:t>iene</w:t>
+      </w:r>
+      <w:r>
+        <w:t xml:space="preserve"> la</w:t>
+      </w:r>
+      <w:r>
+        <w:t xml:space="preserve"> dirección de la variable y el desplaz</w:t>
+      </w:r>
+      <w:r>
+        <w:t>am</w:t>
+      </w:r>
+      <w:r>
+        <w:t>i</w:t>
+      </w:r>
+      <w:r>
+        <w:t>ent</w:t>
+      </w:r>
+      <w:r>
+        <w:t>o es</w:t>
+      </w:r>
+      <w:r>
+        <w:t xml:space="preserve"> el correspon</w:t>
+      </w:r>
+      <w:r>
+        <w:t>di</w:t>
+      </w:r>
+      <w:r>
+        <w:t>ent</w:t>
+      </w:r>
+      <w:r>
+        <w:t>e al campo</w:t>
+      </w:r>
+      <w:r>
+        <w:t xml:space="preserve"> a</w:t>
+      </w:r>
+      <w:r>
+        <w:t xml:space="preserve">l que </w:t>
+      </w:r>
+      <w:r>
+        <w:t>s</w:t>
+      </w:r>
+      <w:r>
+        <w:t xml:space="preserve">e </w:t>
+      </w:r>
+      <w:r>
+        <w:t>accede.</w:t>
+      </w:r>
+    </w:p>
+    <w:p>
+      <w:pPr>
+        <w:pStyle w:val="Ttulo2"/>
+        <w:rPr>
+          <w:lang w:val="es-ES"/>
+        </w:rPr>
+      </w:pPr>
+      <w:r>
+        <w:rPr>
+          <w:lang w:val="es-ES"/>
+        </w:rPr>
+        <w:t>Ej</w:t>
+      </w:r>
+      <w:r>
+        <w:rPr>
+          <w:lang w:val="es-ES"/>
+        </w:rPr>
+        <w:t>ercici</w:t>
+      </w:r>
+      <w:r>
+        <w:rPr>
+          <w:lang w:val="es-ES"/>
+        </w:rPr>
+        <w:t>o</w:t>
+      </w:r>
+      <w:r>
+        <w:rPr>
+          <w:lang w:val="es-ES"/>
+        </w:rPr>
+        <w:t>s</w:t>
+      </w:r>
+      <w:r>
+        <w:rPr>
+          <w:lang w:val="es-ES"/>
+        </w:rPr>
         <w:t xml:space="preserve"> </w:t>
       </w:r>
       <w:r>
+        <w:rPr>
+          <w:lang w:val="es-ES"/>
+        </w:rPr>
+        <w:t>de</w:t>
+      </w:r>
+      <w:r>
+        <w:rPr>
+          <w:lang w:val="es-ES"/>
+        </w:rPr>
+        <w:t xml:space="preserve"> laboratori</w:t>
+      </w:r>
+      <w:r>
+        <w:rPr>
+          <w:lang w:val="es-ES"/>
+        </w:rPr>
+        <w:t>o</w:t>
+      </w:r>
+    </w:p>
+    <w:p>
+      <w:pPr>
+        <w:jc w:val="both"/>
+      </w:pPr>
+      <w:r>
+        <w:t>I</w:t>
+      </w:r>
+      <w:r>
+        <w:t>nicia la versión ejecutable de</w:t>
+      </w:r>
+      <w:r>
+        <w:t xml:space="preserve"> simulador</w:t>
+      </w:r>
+      <w:r>
+        <w:t xml:space="preserve"> en el ordenador. Haz click sobre la pestaña “</w:t>
+      </w:r>
+      <w:r>
+        <w:rPr>
+          <w:rFonts w:ascii="Arial" w:hAnsi="Arial" w:cs="Arial"/>
+        </w:rPr>
+        <w:t>Editor</w:t>
+      </w:r>
+      <w:r>
+        <w:t>” a la izquierda del simulador (flecha roja en la</w:t>
+      </w:r>
+      <w:r>
+        <w:t xml:space="preserve"> </w:t>
+      </w:r>
+      <w:r>
+        <w:t>Figura</w:t>
+      </w:r>
+      <w:r>
+        <w:t xml:space="preserve"> </w:t>
+      </w:r>
+      <w:r>
+        <w:rPr>
+          <w:lang w:val="ca-ES"/>
+        </w:rPr>
+        <w:t>1</w:t>
+      </w:r>
+      <w:r>
+        <w:t>).</w:t>
+      </w:r>
+      <w:r>
+        <w:t xml:space="preserve"> Visualiza el contenido de la memoria mediante la pestaña “</w:t>
+      </w:r>
+      <w:r>
+        <w:rPr>
+          <w:rFonts w:ascii="Arial" w:hAnsi="Arial" w:cs="Arial"/>
+        </w:rPr>
+        <w:t>Memory</w:t>
+      </w:r>
+      <w:r>
+        <w:t xml:space="preserve">” en la parte izquierda a mitad del simulador (flecha azul). </w:t>
+      </w:r>
+      <w:r>
+        <w:t xml:space="preserve">Si no aparece esa pestaña, puedes acceder a la misma información a través de la pestaña del mismo nombre a la izquierda del simulador (debajo de Editor y Processor). </w:t>
+      </w:r>
+      <w:r>
+        <w:t>Ten en cuenta que</w:t>
+      </w:r>
+      <w:r>
+        <w:t>, en la parte del simulador que muestra el contenido de la memoria,</w:t>
+      </w:r>
+    </w:p>
+    <w:p>
+      <w:pPr>
+        <w:jc w:val="both"/>
+      </w:pPr>
+      <w:r>
+        <w:t xml:space="preserve"> la parte inferior del simulador ofrece herramientas para moverte a diferentes posiciones de memoria (segmentos de datos o texto) mediante el menú desplegable “</w:t>
+      </w:r>
+      <w:r>
+        <w:rPr>
+          <w:rFonts w:ascii="Arial" w:hAnsi="Arial" w:cs="Arial"/>
+        </w:rPr>
+        <w:t>Go to register</w:t>
+      </w:r>
+      <w:r>
+        <w:t>”</w:t>
+      </w:r>
+      <w:r>
+        <w:t xml:space="preserve"> (flecha violeta)</w:t>
+      </w:r>
+      <w:r>
+        <w:t xml:space="preserve">, así como mostrar su </w:t>
+      </w:r>
+      <w:r>
+        <w:t>contenido</w:t>
+      </w:r>
+      <w:r>
+        <w:t xml:space="preserve"> en diferentes formatos mediante el menú desplegable </w:t>
+      </w:r>
+      <w:r>
         <w:lastRenderedPageBreak/>
-        <w:t>cont</w:t>
-      </w:r>
-      <w:r>
-        <w:t>iene</w:t>
-      </w:r>
-      <w:r>
-        <w:t xml:space="preserve"> la</w:t>
-      </w:r>
-      <w:r>
-        <w:t xml:space="preserve"> dirección de la variable y el desplaz</w:t>
-      </w:r>
-      <w:r>
-        <w:t>am</w:t>
-      </w:r>
-      <w:r>
-        <w:t>i</w:t>
-      </w:r>
-      <w:r>
-        <w:t>ent</w:t>
-      </w:r>
-      <w:r>
-        <w:t>o es</w:t>
-      </w:r>
-      <w:r>
-        <w:t xml:space="preserve"> el correspon</w:t>
-      </w:r>
-      <w:r>
-        <w:t>di</w:t>
-      </w:r>
-      <w:r>
-        <w:t>ent</w:t>
-      </w:r>
-      <w:r>
-        <w:t>e al campo</w:t>
-      </w:r>
-      <w:r>
-        <w:t xml:space="preserve"> a</w:t>
-      </w:r>
-      <w:r>
-        <w:t xml:space="preserve">l que </w:t>
-      </w:r>
-      <w:r>
-        <w:t>s</w:t>
-      </w:r>
-      <w:r>
-        <w:t xml:space="preserve">e </w:t>
-      </w:r>
-      <w:r>
-        <w:t>accede.</w:t>
-      </w:r>
-    </w:p>
-    <w:p>
-      <w:pPr>
-        <w:pStyle w:val="Ttulo2"/>
-        <w:rPr>
-          <w:lang w:val="es-ES"/>
-        </w:rPr>
-      </w:pPr>
-      <w:r>
-        <w:rPr>
-          <w:lang w:val="es-ES"/>
-        </w:rPr>
-        <w:t>Ej</w:t>
-      </w:r>
-      <w:r>
-        <w:rPr>
-          <w:lang w:val="es-ES"/>
-        </w:rPr>
-        <w:t>ercici</w:t>
-      </w:r>
-      <w:r>
-        <w:rPr>
-          <w:lang w:val="es-ES"/>
-        </w:rPr>
-        <w:t>o</w:t>
-      </w:r>
-      <w:r>
-        <w:rPr>
-          <w:lang w:val="es-ES"/>
-        </w:rPr>
-        <w:t>s</w:t>
-      </w:r>
-      <w:r>
-        <w:rPr>
-          <w:lang w:val="es-ES"/>
-        </w:rPr>
-        <w:t xml:space="preserve"> </w:t>
-      </w:r>
-      <w:r>
-        <w:rPr>
-          <w:lang w:val="es-ES"/>
-        </w:rPr>
-        <w:t>de</w:t>
-      </w:r>
-      <w:r>
-        <w:rPr>
-          <w:lang w:val="es-ES"/>
-        </w:rPr>
-        <w:t xml:space="preserve"> laboratori</w:t>
-      </w:r>
-      <w:r>
-        <w:rPr>
-          <w:lang w:val="es-ES"/>
-        </w:rPr>
-        <w:t>o</w:t>
-      </w:r>
-    </w:p>
-    <w:p>
-      <w:pPr>
-        <w:jc w:val="both"/>
-      </w:pPr>
-      <w:r>
-        <w:t>I</w:t>
-      </w:r>
-      <w:r>
-        <w:t>nicia la versión ejecutable de</w:t>
-      </w:r>
-      <w:r>
-        <w:t xml:space="preserve"> simulador</w:t>
-      </w:r>
-      <w:r>
-        <w:t xml:space="preserve"> en el ordenador. Haz click sobre la pestaña “</w:t>
-      </w:r>
-      <w:r>
-        <w:rPr>
-          <w:rFonts w:ascii="Arial" w:hAnsi="Arial" w:cs="Arial"/>
-        </w:rPr>
-        <w:t>Editor</w:t>
-      </w:r>
-      <w:r>
-        <w:t>” a la izquierda del simulador (flecha roja en la</w:t>
-      </w:r>
-      <w:r>
-        <w:t xml:space="preserve"> </w:t>
-      </w:r>
-      <w:r>
-        <w:t>Figura</w:t>
-      </w:r>
-      <w:r>
-        <w:t xml:space="preserve"> </w:t>
-      </w:r>
-      <w:r>
-        <w:rPr>
-          <w:lang w:val="ca-ES"/>
-        </w:rPr>
-        <w:t>1</w:t>
-      </w:r>
-      <w:r>
-        <w:t>).</w:t>
-      </w:r>
-      <w:r>
-        <w:t xml:space="preserve"> Visualiza el contenido de la memoria mediante la pestaña “</w:t>
-      </w:r>
-      <w:r>
-        <w:rPr>
-          <w:rFonts w:ascii="Arial" w:hAnsi="Arial" w:cs="Arial"/>
-        </w:rPr>
-        <w:t>Memory</w:t>
-      </w:r>
-      <w:r>
-        <w:t xml:space="preserve">” en la parte izquierda a mitad del simulador (flecha azul). </w:t>
-      </w:r>
-      <w:r>
-        <w:t xml:space="preserve">Si no aparece esa pestaña, puedes acceder a la misma información a través de la pestaña del mismo nombre a la izquierda del simulador (debajo de Editor y Processor). </w:t>
-      </w:r>
-      <w:r>
-        <w:t>Ten en cuenta que</w:t>
-      </w:r>
-      <w:r>
-        <w:t>, en la parte del simulador que muestra el contenido de la memoria,</w:t>
-      </w:r>
-    </w:p>
-    <w:p>
-      <w:pPr>
-        <w:jc w:val="both"/>
-      </w:pPr>
-      <w:r>
-        <w:t xml:space="preserve"> la parte inferior del simulador ofrece herramientas para moverte a diferentes posiciones de memoria (segmentos de datos o texto) mediante el menú desplegable “</w:t>
-      </w:r>
-      <w:r>
-        <w:rPr>
-          <w:rFonts w:ascii="Arial" w:hAnsi="Arial" w:cs="Arial"/>
-        </w:rPr>
-        <w:t>Go to register</w:t>
-      </w:r>
-      <w:r>
-        <w:t>”</w:t>
-      </w:r>
-      <w:r>
-        <w:t xml:space="preserve"> (flecha violeta)</w:t>
-      </w:r>
-      <w:r>
-        <w:t xml:space="preserve">, así como mostrar su </w:t>
-      </w:r>
-      <w:r>
-        <w:t>contenido</w:t>
-      </w:r>
-      <w:r>
-        <w:t xml:space="preserve"> en diferentes formatos mediante el menú desplegable “</w:t>
+        <w:t>“</w:t>
       </w:r>
       <w:r>
         <w:rPr>
@@ -8873,16 +8836,6 @@
           <w:lang w:val="en-US"/>
         </w:rPr>
         <w:br/>
-      </w:r>
-      <w:r>
-        <w:rPr>
-          <w:b w:val="0"/>
-          <w:bCs/>
-          <w:sz w:val="20"/>
-          <w:szCs w:val="28"/>
-          <w:lang w:val="en-US"/>
-        </w:rPr>
-        <w:lastRenderedPageBreak/>
         <w:t xml:space="preserve">         add s0,t1,t0</w:t>
       </w:r>
       <w:r>
@@ -9090,6 +9043,7 @@
           <w:ilvl w:val="0"/>
           <w:numId w:val="36"/>
         </w:numPr>
+        <w:spacing w:line="240" w:lineRule="auto"/>
       </w:pPr>
       <w:r>
         <w:t xml:space="preserve">¿Cuántas instrucciones máquina comprende el programa? </w:t>
@@ -9102,6 +9056,7 @@
           <w:ilvl w:val="0"/>
           <w:numId w:val="36"/>
         </w:numPr>
+        <w:spacing w:line="240" w:lineRule="auto"/>
       </w:pPr>
       <w:r>
         <w:t>¿En qué instrucciones máquina se traducen las pseudoinstruccion</w:t>
@@ -9120,6 +9075,7 @@
           <w:ilvl w:val="0"/>
           <w:numId w:val="36"/>
         </w:numPr>
+        <w:spacing w:line="240" w:lineRule="auto"/>
       </w:pPr>
       <w:r>
         <w:t xml:space="preserve">¿En qué dirección de memoria se encuentra la instrucción </w:t>
@@ -9143,6 +9099,7 @@
           <w:ilvl w:val="0"/>
           <w:numId w:val="36"/>
         </w:numPr>
+        <w:spacing w:line="240" w:lineRule="auto"/>
       </w:pPr>
       <w:r>
         <w:t xml:space="preserve">¿Qué instrucción del programa se codifica como </w:t>
@@ -9166,8 +9123,10 @@
           <w:ilvl w:val="0"/>
           <w:numId w:val="36"/>
         </w:numPr>
-      </w:pPr>
-      <w:r>
+        <w:spacing w:line="240" w:lineRule="auto"/>
+      </w:pPr>
+      <w:r>
+        <w:lastRenderedPageBreak/>
         <w:t>Indica</w:t>
       </w:r>
       <w:r>
@@ -9181,6 +9140,7 @@
           <w:ilvl w:val="0"/>
           <w:numId w:val="36"/>
         </w:numPr>
+        <w:spacing w:line="240" w:lineRule="auto"/>
       </w:pPr>
       <w:r>
         <w:t>Modifi</w:t>
@@ -9586,6 +9546,7 @@
           <w:ilvl w:val="0"/>
           <w:numId w:val="36"/>
         </w:numPr>
+        <w:spacing w:line="240" w:lineRule="auto"/>
       </w:pPr>
       <w:r>
         <w:t xml:space="preserve">¿Cuántos bytes de la memoria principal están ocupados por las variables del programa? </w:t>
@@ -9598,6 +9559,7 @@
           <w:ilvl w:val="0"/>
           <w:numId w:val="36"/>
         </w:numPr>
+        <w:spacing w:line="240" w:lineRule="auto"/>
       </w:pPr>
       <w:r>
         <w:t xml:space="preserve">¿Cuántas instrucciones de acceso a la memoria contiene el programa? </w:t>
@@ -9610,6 +9572,7 @@
           <w:ilvl w:val="0"/>
           <w:numId w:val="36"/>
         </w:numPr>
+        <w:spacing w:line="240" w:lineRule="auto"/>
       </w:pPr>
       <w:r>
         <w:t xml:space="preserve">¿En qué dirección se escribe el valor del perímetro? </w:t>
@@ -9622,9 +9585,9 @@
           <w:ilvl w:val="0"/>
           <w:numId w:val="36"/>
         </w:numPr>
-      </w:pPr>
-      <w:r>
-        <w:lastRenderedPageBreak/>
+        <w:spacing w:line="240" w:lineRule="auto"/>
+      </w:pPr>
+      <w:r>
         <w:t xml:space="preserve">Teniendo en cuenta que el simulador Ripes ubica el segmento de datos a partir de la dirección </w:t>
       </w:r>
       <w:r>
@@ -9687,6 +9650,7 @@
           <w:ilvl w:val="0"/>
           <w:numId w:val="36"/>
         </w:numPr>
+        <w:spacing w:line="240" w:lineRule="auto"/>
       </w:pPr>
       <w:r>
         <w:t xml:space="preserve">¿Para qué se usa la directiva </w:t>
@@ -9722,6 +9686,7 @@
           <w:ilvl w:val="0"/>
           <w:numId w:val="36"/>
         </w:numPr>
+        <w:spacing w:line="240" w:lineRule="auto"/>
       </w:pPr>
       <w:r>
         <w:t xml:space="preserve">¿Qué valor </w:t>
@@ -9866,6 +9831,7 @@
         <w:jc w:val="both"/>
       </w:pPr>
       <w:r>
+        <w:lastRenderedPageBreak/>
         <w:t xml:space="preserve">En este ejercicio vamos a mostrar el mecanismo para imprimir el valor del perímetro del rectángulo </w:t>
       </w:r>
       <w:r>
@@ -10253,6 +10219,7 @@
           <w:ilvl w:val="0"/>
           <w:numId w:val="16"/>
         </w:numPr>
+        <w:spacing w:line="240" w:lineRule="auto"/>
       </w:pPr>
       <w:r>
         <w:t>¿</w:t>
@@ -10308,6 +10275,7 @@
           <w:ilvl w:val="0"/>
           <w:numId w:val="16"/>
         </w:numPr>
+        <w:spacing w:line="240" w:lineRule="auto"/>
       </w:pPr>
       <w:r>
         <w:t xml:space="preserve">¿En </w:t>
@@ -10375,6 +10343,7 @@
           <w:ilvl w:val="0"/>
           <w:numId w:val="16"/>
         </w:numPr>
+        <w:spacing w:line="240" w:lineRule="auto"/>
         <w:rPr>
           <w:lang w:val="es-ES_tradnl"/>
         </w:rPr>
@@ -10500,6 +10469,7 @@
           <w:ilvl w:val="0"/>
           <w:numId w:val="39"/>
         </w:numPr>
+        <w:spacing w:line="240" w:lineRule="auto"/>
       </w:pPr>
       <w:r>
         <w:t xml:space="preserve">ejecutarse correctamente, aunque potencialmente con mayor coste; </w:t>
@@ -10512,9 +10482,9 @@
           <w:ilvl w:val="0"/>
           <w:numId w:val="39"/>
         </w:numPr>
-      </w:pPr>
-      <w:r>
-        <w:lastRenderedPageBreak/>
+        <w:spacing w:line="240" w:lineRule="auto"/>
+      </w:pPr>
+      <w:r>
         <w:t xml:space="preserve">provocar una excepción/trap de acceso no alineado; </w:t>
       </w:r>
     </w:p>
@@ -10525,6 +10495,7 @@
           <w:ilvl w:val="0"/>
           <w:numId w:val="39"/>
         </w:numPr>
+        <w:spacing w:line="240" w:lineRule="auto"/>
       </w:pPr>
       <w:r>
         <w:t>ser manejado por software.</w:t>
@@ -10533,6 +10504,7 @@
     <w:p>
       <w:pPr>
         <w:pStyle w:val="Prrafodelista"/>
+        <w:spacing w:line="240" w:lineRule="auto"/>
       </w:pPr>
       <w:r>
         <w:t>El simulador Ripes, al ten</w:t>
@@ -10882,6 +10854,7 @@
         </w:numPr>
       </w:pPr>
       <w:r>
+        <w:lastRenderedPageBreak/>
         <w:t xml:space="preserve">¿Cuáles de </w:t>
       </w:r>
       <w:r>
@@ -11567,7 +11540,6 @@
         </w:numPr>
       </w:pPr>
       <w:r>
-        <w:lastRenderedPageBreak/>
         <w:t xml:space="preserve">Como traducirías </w:t>
       </w:r>
       <w:r>
@@ -11831,6 +11803,7 @@
           <w:bCs/>
           <w:lang w:val="fr-FR"/>
         </w:rPr>
+        <w:lastRenderedPageBreak/>
         <w:t>la t0,X</w:t>
       </w:r>
       <w:r>

</xml_diff>